<commit_message>
deleted the file with the dollar sign and added the git fame
</commit_message>
<xml_diff>
--- a/Assignment2/Figures/Team_effort_distribution_template.docx
+++ b/Assignment2/Figures/Team_effort_distribution_template.docx
@@ -209,7 +209,25 @@
         <w:rPr>
           <w:lang w:val="en-US"/>
         </w:rPr>
-        <w:t xml:space="preserve">2.1 B and </w:t>
+        <w:t>(</w:t>
+      </w:r>
+      <w:r>
+        <w:rPr>
+          <w:lang w:val="en-US"/>
+        </w:rPr>
+        <w:t>2.1 B</w:t>
+      </w:r>
+      <w:r>
+        <w:rPr>
+          <w:lang w:val="en-US"/>
+        </w:rPr>
+        <w:t xml:space="preserve">) </w:t>
+      </w:r>
+      <w:r>
+        <w:rPr>
+          <w:lang w:val="en-US"/>
+        </w:rPr>
+        <w:t xml:space="preserve">and </w:t>
       </w:r>
       <w:r>
         <w:rPr>
@@ -345,6 +363,18 @@
         </w:rPr>
         <w:t xml:space="preserve">: </w:t>
       </w:r>
+      <w:r>
+        <w:rPr>
+          <w:lang w:val="en-US"/>
+        </w:rPr>
+        <w:t xml:space="preserve">08.03.2026 - </w:t>
+      </w:r>
+      <w:r>
+        <w:rPr>
+          <w:lang w:val="en-US"/>
+        </w:rPr>
+        <w:t>15:04</w:t>
+      </w:r>
     </w:p>
     <w:p>
       <w:pPr>
@@ -393,6 +423,48 @@
           <w:lang w:val="en-US"/>
         </w:rPr>
       </w:pPr>
+      <w:r>
+        <w:rPr>
+          <w:b/>
+          <w:bCs/>
+          <w:lang w:val="en-US"/>
+        </w:rPr>
+        <w:drawing>
+          <wp:inline distT="0" distB="0" distL="0" distR="0" wp14:anchorId="42E80F43" wp14:editId="52E95824">
+            <wp:extent cx="5731510" cy="1028065"/>
+            <wp:effectExtent l="0" t="0" r="2540" b="635"/>
+            <wp:docPr id="1233181173" name="Picture 1" descr="A computer screen with numbers and letters&#10;&#10;AI-generated content may be incorrect."/>
+            <wp:cNvGraphicFramePr>
+              <a:graphicFrameLocks xmlns:a="http://schemas.openxmlformats.org/drawingml/2006/main" noChangeAspect="1"/>
+            </wp:cNvGraphicFramePr>
+            <a:graphic xmlns:a="http://schemas.openxmlformats.org/drawingml/2006/main">
+              <a:graphicData uri="http://schemas.openxmlformats.org/drawingml/2006/picture">
+                <pic:pic xmlns:pic="http://schemas.openxmlformats.org/drawingml/2006/picture">
+                  <pic:nvPicPr>
+                    <pic:cNvPr id="1233181173" name="Picture 1" descr="A computer screen with numbers and letters&#10;&#10;AI-generated content may be incorrect."/>
+                    <pic:cNvPicPr/>
+                  </pic:nvPicPr>
+                  <pic:blipFill>
+                    <a:blip r:embed="rId5"/>
+                    <a:stretch>
+                      <a:fillRect/>
+                    </a:stretch>
+                  </pic:blipFill>
+                  <pic:spPr>
+                    <a:xfrm>
+                      <a:off x="0" y="0"/>
+                      <a:ext cx="5731510" cy="1028065"/>
+                    </a:xfrm>
+                    <a:prstGeom prst="rect">
+                      <a:avLst/>
+                    </a:prstGeom>
+                  </pic:spPr>
+                </pic:pic>
+              </a:graphicData>
+            </a:graphic>
+          </wp:inline>
+        </w:drawing>
+      </w:r>
     </w:p>
     <w:sectPr>
       <w:pgSz w:w="11906" w:h="16838"/>

</xml_diff>